<commit_message>
Documento de Visión Corrección Comando: número de página en el pie de todas las páginas
Co-Authored-By: Claude Opus 5.5 <noreply@anthropic.com>
</commit_message>
<xml_diff>
--- a/NuestrosAvances/DocumentoDeVision/Documento de Visión Corrección Comando.docx
+++ b/NuestrosAvances/DocumentoDeVision/Documento de Visión Corrección Comando.docx
@@ -7581,6 +7581,7 @@
     </w:p>
     <w:sectPr>
       <w:headerReference w:type="default" r:id="rId24"/>
+      <w:footerReference w:type="default" r:id="rId27"/>
       <w:pgSz w:w="11906" w:h="16838"/>
       <w:pgMar w:top="2948" w:right="1701" w:bottom="2948" w:left="1701" w:header="709" w:footer="709" w:gutter="0"/>
       <w:cols w:space="708"/>
@@ -7613,6 +7614,62 @@
     </w:p>
   </w:endnote>
 </w:endnotes>
+</file>
+
+<file path=word/footer1.xml><?xml version="1.0" encoding="utf-8"?>
+<w:ftr xmlns:m="http://schemas.openxmlformats.org/officeDocument/2006/math" xmlns:mc="http://schemas.openxmlformats.org/markup-compatibility/2006" xmlns:mo="http://schemas.microsoft.com/office/mac/office/2008/main" xmlns:mv="urn:schemas-microsoft-com:mac:vml" xmlns:o="urn:schemas-microsoft-com:office:office" xmlns:r="http://schemas.openxmlformats.org/officeDocument/2006/relationships" xmlns:v="urn:schemas-microsoft-com:vml" xmlns:w10="urn:schemas-microsoft-com:office:word" xmlns:w14="http://schemas.microsoft.com/office/word/2010/wordml" xmlns:w="http://schemas.openxmlformats.org/wordprocessingml/2006/main" xmlns:wne="http://schemas.microsoft.com/office/word/2006/wordml" xmlns:wp14="http://schemas.microsoft.com/office/word/2010/wordprocessingDrawing" xmlns:wp="http://schemas.openxmlformats.org/drawingml/2006/wordprocessingDrawing" xmlns:wpc="http://schemas.microsoft.com/office/word/2010/wordprocessingCanvas" xmlns:wpg="http://schemas.microsoft.com/office/word/2010/wordprocessingGroup" xmlns:wpi="http://schemas.microsoft.com/office/word/2010/wordprocessingInk" xmlns:wps="http://schemas.microsoft.com/office/word/2010/wordprocessingShape" mc:Ignorable="w14 wp14">
+  <w:p>
+    <w:pPr>
+      <w:pStyle w:val="Footer"/>
+      <w:jc w:val="center"/>
+    </w:pPr>
+    <w:r>
+      <w:rPr>
+        <w:rFonts w:ascii="Poppins" w:hAnsi="Poppins" w:cs="Poppins"/>
+        <w:b/>
+        <w:color w:val="222222"/>
+        <w:sz w:val="20"/>
+      </w:rPr>
+      <w:fldChar w:fldCharType="begin"/>
+    </w:r>
+    <w:r>
+      <w:rPr>
+        <w:rFonts w:ascii="Poppins" w:hAnsi="Poppins" w:cs="Poppins"/>
+        <w:b/>
+        <w:color w:val="222222"/>
+        <w:sz w:val="20"/>
+      </w:rPr>
+      <w:instrText xml:space="preserve"> PAGE </w:instrText>
+    </w:r>
+    <w:r>
+      <w:rPr>
+        <w:rFonts w:ascii="Poppins" w:hAnsi="Poppins" w:cs="Poppins"/>
+        <w:b/>
+        <w:color w:val="222222"/>
+        <w:sz w:val="20"/>
+      </w:rPr>
+      <w:fldChar w:fldCharType="separate"/>
+    </w:r>
+    <w:r>
+      <w:rPr>
+        <w:rFonts w:ascii="Poppins" w:hAnsi="Poppins" w:cs="Poppins"/>
+        <w:b/>
+        <w:color w:val="222222"/>
+        <w:sz w:val="20"/>
+      </w:rPr>
+      <w:t>1</w:t>
+    </w:r>
+    <w:r>
+      <w:rPr>
+        <w:rFonts w:ascii="Poppins" w:hAnsi="Poppins" w:cs="Poppins"/>
+        <w:b/>
+        <w:color w:val="222222"/>
+        <w:sz w:val="20"/>
+      </w:rPr>
+      <w:fldChar w:fldCharType="end"/>
+    </w:r>
+  </w:p>
+</w:ftr>
 </file>
 
 <file path=word/footnotes.xml><?xml version="1.0" encoding="utf-8"?>

</xml_diff>

<commit_message>
Documento de Visión Corrección Comando: número de página arriba a la derecha
Co-Authored-By: Claude Opus 5.5 <noreply@anthropic.com>
</commit_message>
<xml_diff>
--- a/NuestrosAvances/DocumentoDeVision/Documento de Visión Corrección Comando.docx
+++ b/NuestrosAvances/DocumentoDeVision/Documento de Visión Corrección Comando.docx
@@ -7623,51 +7623,6 @@
       <w:pStyle w:val="Footer"/>
       <w:jc w:val="center"/>
     </w:pPr>
-    <w:r>
-      <w:rPr>
-        <w:rFonts w:ascii="Poppins" w:hAnsi="Poppins" w:cs="Poppins"/>
-        <w:b/>
-        <w:color w:val="222222"/>
-        <w:sz w:val="20"/>
-      </w:rPr>
-      <w:fldChar w:fldCharType="begin"/>
-    </w:r>
-    <w:r>
-      <w:rPr>
-        <w:rFonts w:ascii="Poppins" w:hAnsi="Poppins" w:cs="Poppins"/>
-        <w:b/>
-        <w:color w:val="222222"/>
-        <w:sz w:val="20"/>
-      </w:rPr>
-      <w:instrText xml:space="preserve"> PAGE </w:instrText>
-    </w:r>
-    <w:r>
-      <w:rPr>
-        <w:rFonts w:ascii="Poppins" w:hAnsi="Poppins" w:cs="Poppins"/>
-        <w:b/>
-        <w:color w:val="222222"/>
-        <w:sz w:val="20"/>
-      </w:rPr>
-      <w:fldChar w:fldCharType="separate"/>
-    </w:r>
-    <w:r>
-      <w:rPr>
-        <w:rFonts w:ascii="Poppins" w:hAnsi="Poppins" w:cs="Poppins"/>
-        <w:b/>
-        <w:color w:val="222222"/>
-        <w:sz w:val="20"/>
-      </w:rPr>
-      <w:t>1</w:t>
-    </w:r>
-    <w:r>
-      <w:rPr>
-        <w:rFonts w:ascii="Poppins" w:hAnsi="Poppins" w:cs="Poppins"/>
-        <w:b/>
-        <w:color w:val="222222"/>
-        <w:sz w:val="20"/>
-      </w:rPr>
-      <w:fldChar w:fldCharType="end"/>
-    </w:r>
   </w:p>
 </w:ftr>
 </file>
@@ -7702,6 +7657,7 @@
   <w:p>
     <w:pPr>
       <w:pStyle w:val="Encabezado"/>
+      <w:jc w:val="right"/>
     </w:pPr>
     <w:r>
       <w:rPr>
@@ -7924,6 +7880,51 @@
           </a:graphic>
         </wp:anchor>
       </w:drawing>
+    </w:r>
+    <w:r>
+      <w:rPr>
+        <w:rFonts w:ascii="Poppins" w:hAnsi="Poppins" w:cs="Poppins"/>
+        <w:b/>
+        <w:color w:val="222222"/>
+        <w:sz w:val="20"/>
+      </w:rPr>
+      <w:fldChar w:fldCharType="begin"/>
+    </w:r>
+    <w:r>
+      <w:rPr>
+        <w:rFonts w:ascii="Poppins" w:hAnsi="Poppins" w:cs="Poppins"/>
+        <w:b/>
+        <w:color w:val="222222"/>
+        <w:sz w:val="20"/>
+      </w:rPr>
+      <w:instrText xml:space="preserve"> PAGE </w:instrText>
+    </w:r>
+    <w:r>
+      <w:rPr>
+        <w:rFonts w:ascii="Poppins" w:hAnsi="Poppins" w:cs="Poppins"/>
+        <w:b/>
+        <w:color w:val="222222"/>
+        <w:sz w:val="20"/>
+      </w:rPr>
+      <w:fldChar w:fldCharType="separate"/>
+    </w:r>
+    <w:r>
+      <w:rPr>
+        <w:rFonts w:ascii="Poppins" w:hAnsi="Poppins" w:cs="Poppins"/>
+        <w:b/>
+        <w:color w:val="222222"/>
+        <w:sz w:val="20"/>
+      </w:rPr>
+      <w:t>1</w:t>
+    </w:r>
+    <w:r>
+      <w:rPr>
+        <w:rFonts w:ascii="Poppins" w:hAnsi="Poppins" w:cs="Poppins"/>
+        <w:b/>
+        <w:color w:val="222222"/>
+        <w:sz w:val="20"/>
+      </w:rPr>
+      <w:fldChar w:fldCharType="end"/>
     </w:r>
   </w:p>
 </w:hdr>

</xml_diff>

<commit_message>
Documento de Visión Corrección Comando: portada sin número de página
Co-Authored-By: Claude Opus 5.5 <noreply@anthropic.com>
</commit_message>
<xml_diff>
--- a/NuestrosAvances/DocumentoDeVision/Documento de Visión Corrección Comando.docx
+++ b/NuestrosAvances/DocumentoDeVision/Documento de Visión Corrección Comando.docx
@@ -7582,9 +7582,12 @@
     <w:sectPr>
       <w:headerReference w:type="default" r:id="rId24"/>
       <w:footerReference w:type="default" r:id="rId27"/>
+      <w:headerReference w:type="first" r:id="rId28"/>
+      <w:footerReference w:type="first" r:id="rId29"/>
       <w:pgSz w:w="11906" w:h="16838"/>
       <w:pgMar w:top="2948" w:right="1701" w:bottom="2948" w:left="1701" w:header="709" w:footer="709" w:gutter="0"/>
       <w:cols w:space="708"/>
+      <w:titlePg/>
       <w:docGrid w:linePitch="360"/>
     </w:sectPr>
   </w:body>
@@ -7622,6 +7625,16 @@
     <w:pPr>
       <w:pStyle w:val="Footer"/>
       <w:jc w:val="center"/>
+    </w:pPr>
+  </w:p>
+</w:ftr>
+</file>
+
+<file path=word/footer2.xml><?xml version="1.0" encoding="utf-8"?>
+<w:ftr xmlns:m="http://schemas.openxmlformats.org/officeDocument/2006/math" xmlns:mc="http://schemas.openxmlformats.org/markup-compatibility/2006" xmlns:mo="http://schemas.microsoft.com/office/mac/office/2008/main" xmlns:mv="urn:schemas-microsoft-com:mac:vml" xmlns:o="urn:schemas-microsoft-com:office:office" xmlns:r="http://schemas.openxmlformats.org/officeDocument/2006/relationships" xmlns:v="urn:schemas-microsoft-com:vml" xmlns:w10="urn:schemas-microsoft-com:office:word" xmlns:w14="http://schemas.microsoft.com/office/word/2010/wordml" xmlns:w="http://schemas.openxmlformats.org/wordprocessingml/2006/main" xmlns:wne="http://schemas.microsoft.com/office/word/2006/wordml" xmlns:wp14="http://schemas.microsoft.com/office/word/2010/wordprocessingDrawing" xmlns:wp="http://schemas.openxmlformats.org/drawingml/2006/wordprocessingDrawing" xmlns:wpc="http://schemas.microsoft.com/office/word/2010/wordprocessingCanvas" xmlns:wpg="http://schemas.microsoft.com/office/word/2010/wordprocessingGroup" xmlns:wpi="http://schemas.microsoft.com/office/word/2010/wordprocessingInk" xmlns:wps="http://schemas.microsoft.com/office/word/2010/wordprocessingShape" mc:Ignorable="w14 wp14">
+  <w:p>
+    <w:pPr>
+      <w:pStyle w:val="Footer"/>
     </w:pPr>
   </w:p>
 </w:ftr>
@@ -7925,6 +7938,239 @@
         <w:sz w:val="20"/>
       </w:rPr>
       <w:fldChar w:fldCharType="end"/>
+    </w:r>
+  </w:p>
+</w:hdr>
+</file>
+
+<file path=word/header2.xml><?xml version="1.0" encoding="utf-8"?>
+<w:hdr xmlns:m="http://schemas.openxmlformats.org/officeDocument/2006/math" xmlns:mc="http://schemas.openxmlformats.org/markup-compatibility/2006" xmlns:mo="http://schemas.microsoft.com/office/mac/office/2008/main" xmlns:mv="urn:schemas-microsoft-com:mac:vml" xmlns:o="urn:schemas-microsoft-com:office:office" xmlns:r="http://schemas.openxmlformats.org/officeDocument/2006/relationships" xmlns:v="urn:schemas-microsoft-com:vml" xmlns:w10="urn:schemas-microsoft-com:office:word" xmlns:w14="http://schemas.microsoft.com/office/word/2010/wordml" xmlns:w="http://schemas.openxmlformats.org/wordprocessingml/2006/main" xmlns:wne="http://schemas.microsoft.com/office/word/2006/wordml" xmlns:wp14="http://schemas.microsoft.com/office/word/2010/wordprocessingDrawing" xmlns:wp="http://schemas.openxmlformats.org/drawingml/2006/wordprocessingDrawing" xmlns:wpc="http://schemas.microsoft.com/office/word/2010/wordprocessingCanvas" xmlns:wpg="http://schemas.microsoft.com/office/word/2010/wordprocessingGroup" xmlns:wpi="http://schemas.microsoft.com/office/word/2010/wordprocessingInk" xmlns:wps="http://schemas.microsoft.com/office/word/2010/wordprocessingShape" mc:Ignorable="w14 wp14">
+  <w:p>
+    <w:pPr>
+      <w:pStyle w:val="Encabezado"/>
+      <w:jc w:val="right"/>
+    </w:pPr>
+    <w:r>
+      <w:rPr>
+        <w:noProof/>
+      </w:rPr>
+      <w:drawing>
+        <wp:anchor distT="0" distB="0" distL="114300" distR="114300" simplePos="0" relativeHeight="251661312" behindDoc="1" locked="0" layoutInCell="1" allowOverlap="1" wp14:anchorId="6D3A46D8" wp14:editId="6FBCB6DD">
+          <wp:simplePos x="0" y="0"/>
+          <wp:positionH relativeFrom="page">
+            <wp:posOffset>6667499</wp:posOffset>
+          </wp:positionH>
+          <wp:positionV relativeFrom="paragraph">
+            <wp:posOffset>-449580</wp:posOffset>
+          </wp:positionV>
+          <wp:extent cx="894715" cy="894715"/>
+          <wp:effectExtent l="0" t="0" r="0" b="0"/>
+          <wp:wrapNone/>
+          <wp:docPr id="8" name="Imagen 8"/>
+          <wp:cNvGraphicFramePr>
+            <a:graphicFrameLocks xmlns:a="http://schemas.openxmlformats.org/drawingml/2006/main" noChangeAspect="1"/>
+          </wp:cNvGraphicFramePr>
+          <a:graphic xmlns:a="http://schemas.openxmlformats.org/drawingml/2006/main">
+            <a:graphicData uri="http://schemas.openxmlformats.org/drawingml/2006/picture">
+              <pic:pic xmlns:pic="http://schemas.openxmlformats.org/drawingml/2006/picture">
+                <pic:nvPicPr>
+                  <pic:cNvPr id="8" name="Imagen 8"/>
+                  <pic:cNvPicPr/>
+                </pic:nvPicPr>
+                <pic:blipFill>
+                  <a:blip r:embed="rId1">
+                    <a:extLst>
+                      <a:ext uri="{28A0092B-C50C-407E-A947-70E740481C1C}">
+                        <a14:useLocalDpi xmlns:a14="http://schemas.microsoft.com/office/drawing/2010/main" val="0"/>
+                      </a:ext>
+                    </a:extLst>
+                  </a:blip>
+                  <a:stretch>
+                    <a:fillRect/>
+                  </a:stretch>
+                </pic:blipFill>
+                <pic:spPr>
+                  <a:xfrm>
+                    <a:off x="0" y="0"/>
+                    <a:ext cx="894715" cy="894715"/>
+                  </a:xfrm>
+                  <a:prstGeom prst="rect">
+                    <a:avLst/>
+                  </a:prstGeom>
+                </pic:spPr>
+              </pic:pic>
+            </a:graphicData>
+          </a:graphic>
+          <wp14:sizeRelH relativeFrom="margin">
+            <wp14:pctWidth>0</wp14:pctWidth>
+          </wp14:sizeRelH>
+          <wp14:sizeRelV relativeFrom="margin">
+            <wp14:pctHeight>0</wp14:pctHeight>
+          </wp14:sizeRelV>
+        </wp:anchor>
+      </w:drawing>
+    </w:r>
+    <w:r>
+      <w:rPr>
+        <w:noProof/>
+      </w:rPr>
+      <w:drawing>
+        <wp:anchor distT="0" distB="0" distL="114300" distR="114300" simplePos="0" relativeHeight="251660288" behindDoc="1" locked="0" layoutInCell="1" allowOverlap="1" wp14:anchorId="35C039CA" wp14:editId="2A75DDD0">
+          <wp:simplePos x="0" y="0"/>
+          <wp:positionH relativeFrom="page">
+            <wp:align>left</wp:align>
+          </wp:positionH>
+          <wp:positionV relativeFrom="paragraph">
+            <wp:posOffset>4827270</wp:posOffset>
+          </wp:positionV>
+          <wp:extent cx="5400040" cy="5400040"/>
+          <wp:effectExtent l="0" t="0" r="0" b="0"/>
+          <wp:wrapNone/>
+          <wp:docPr id="5" name="Imagen 5"/>
+          <wp:cNvGraphicFramePr>
+            <a:graphicFrameLocks xmlns:a="http://schemas.openxmlformats.org/drawingml/2006/main" noChangeAspect="1"/>
+          </wp:cNvGraphicFramePr>
+          <a:graphic xmlns:a="http://schemas.openxmlformats.org/drawingml/2006/main">
+            <a:graphicData uri="http://schemas.openxmlformats.org/drawingml/2006/picture">
+              <pic:pic xmlns:pic="http://schemas.openxmlformats.org/drawingml/2006/picture">
+                <pic:nvPicPr>
+                  <pic:cNvPr id="4" name="Imagen 4"/>
+                  <pic:cNvPicPr/>
+                </pic:nvPicPr>
+                <pic:blipFill>
+                  <a:blip r:embed="rId2">
+                    <a:extLst>
+                      <a:ext uri="{28A0092B-C50C-407E-A947-70E740481C1C}">
+                        <a14:useLocalDpi xmlns:a14="http://schemas.microsoft.com/office/drawing/2010/main" val="0"/>
+                      </a:ext>
+                    </a:extLst>
+                  </a:blip>
+                  <a:stretch>
+                    <a:fillRect/>
+                  </a:stretch>
+                </pic:blipFill>
+                <pic:spPr>
+                  <a:xfrm>
+                    <a:off x="0" y="0"/>
+                    <a:ext cx="5400040" cy="5400040"/>
+                  </a:xfrm>
+                  <a:prstGeom prst="rect">
+                    <a:avLst/>
+                  </a:prstGeom>
+                </pic:spPr>
+              </pic:pic>
+            </a:graphicData>
+          </a:graphic>
+        </wp:anchor>
+      </w:drawing>
+    </w:r>
+    <w:r>
+      <w:rPr>
+        <w:noProof/>
+      </w:rPr>
+      <w:drawing>
+        <wp:anchor distT="0" distB="0" distL="114300" distR="114300" simplePos="0" relativeHeight="251659264" behindDoc="1" locked="0" layoutInCell="1" allowOverlap="1" wp14:anchorId="06CB4FD4" wp14:editId="40C234A2">
+          <wp:simplePos x="0" y="0"/>
+          <wp:positionH relativeFrom="page">
+            <wp:align>right</wp:align>
+          </wp:positionH>
+          <wp:positionV relativeFrom="paragraph">
+            <wp:posOffset>4827270</wp:posOffset>
+          </wp:positionV>
+          <wp:extent cx="5400040" cy="5400040"/>
+          <wp:effectExtent l="0" t="0" r="0" b="0"/>
+          <wp:wrapNone/>
+          <wp:docPr id="6" name="Imagen 6"/>
+          <wp:cNvGraphicFramePr>
+            <a:graphicFrameLocks xmlns:a="http://schemas.openxmlformats.org/drawingml/2006/main" noChangeAspect="1"/>
+          </wp:cNvGraphicFramePr>
+          <a:graphic xmlns:a="http://schemas.openxmlformats.org/drawingml/2006/main">
+            <a:graphicData uri="http://schemas.openxmlformats.org/drawingml/2006/picture">
+              <pic:pic xmlns:pic="http://schemas.openxmlformats.org/drawingml/2006/picture">
+                <pic:nvPicPr>
+                  <pic:cNvPr id="3" name="Imagen 3"/>
+                  <pic:cNvPicPr/>
+                </pic:nvPicPr>
+                <pic:blipFill>
+                  <a:blip r:embed="rId3">
+                    <a:extLst>
+                      <a:ext uri="{28A0092B-C50C-407E-A947-70E740481C1C}">
+                        <a14:useLocalDpi xmlns:a14="http://schemas.microsoft.com/office/drawing/2010/main" val="0"/>
+                      </a:ext>
+                    </a:extLst>
+                  </a:blip>
+                  <a:stretch>
+                    <a:fillRect/>
+                  </a:stretch>
+                </pic:blipFill>
+                <pic:spPr>
+                  <a:xfrm>
+                    <a:off x="0" y="0"/>
+                    <a:ext cx="5400040" cy="5400040"/>
+                  </a:xfrm>
+                  <a:prstGeom prst="rect">
+                    <a:avLst/>
+                  </a:prstGeom>
+                </pic:spPr>
+              </pic:pic>
+            </a:graphicData>
+          </a:graphic>
+        </wp:anchor>
+      </w:drawing>
+    </w:r>
+    <w:r>
+      <w:rPr>
+        <w:noProof/>
+      </w:rPr>
+      <w:drawing>
+        <wp:anchor distT="0" distB="0" distL="114300" distR="114300" simplePos="0" relativeHeight="251658240" behindDoc="1" locked="0" layoutInCell="1" allowOverlap="1" wp14:anchorId="756A02AA" wp14:editId="7EF52F76">
+          <wp:simplePos x="0" y="0"/>
+          <wp:positionH relativeFrom="page">
+            <wp:align>left</wp:align>
+          </wp:positionH>
+          <wp:positionV relativeFrom="paragraph">
+            <wp:posOffset>-449580</wp:posOffset>
+          </wp:positionV>
+          <wp:extent cx="5400040" cy="5400040"/>
+          <wp:effectExtent l="0" t="0" r="0" b="0"/>
+          <wp:wrapNone/>
+          <wp:docPr id="7" name="Imagen 7"/>
+          <wp:cNvGraphicFramePr>
+            <a:graphicFrameLocks xmlns:a="http://schemas.openxmlformats.org/drawingml/2006/main" noChangeAspect="1"/>
+          </wp:cNvGraphicFramePr>
+          <a:graphic xmlns:a="http://schemas.openxmlformats.org/drawingml/2006/main">
+            <a:graphicData uri="http://schemas.openxmlformats.org/drawingml/2006/picture">
+              <pic:pic xmlns:pic="http://schemas.openxmlformats.org/drawingml/2006/picture">
+                <pic:nvPicPr>
+                  <pic:cNvPr id="2" name="Imagen 2"/>
+                  <pic:cNvPicPr/>
+                </pic:nvPicPr>
+                <pic:blipFill>
+                  <a:blip r:embed="rId4">
+                    <a:extLst>
+                      <a:ext uri="{28A0092B-C50C-407E-A947-70E740481C1C}">
+                        <a14:useLocalDpi xmlns:a14="http://schemas.microsoft.com/office/drawing/2010/main" val="0"/>
+                      </a:ext>
+                    </a:extLst>
+                  </a:blip>
+                  <a:stretch>
+                    <a:fillRect/>
+                  </a:stretch>
+                </pic:blipFill>
+                <pic:spPr>
+                  <a:xfrm>
+                    <a:off x="0" y="0"/>
+                    <a:ext cx="5400040" cy="5400040"/>
+                  </a:xfrm>
+                  <a:prstGeom prst="rect">
+                    <a:avLst/>
+                  </a:prstGeom>
+                </pic:spPr>
+              </pic:pic>
+            </a:graphicData>
+          </a:graphic>
+        </wp:anchor>
+      </w:drawing>
     </w:r>
   </w:p>
 </w:hdr>

</xml_diff>